<commit_message>
CaF2 long-acquisition comparison: no counts scale bars (SHOW_COUNTS switch)
Co-Authored-By: Claude Opus 5.5 <noreply@anthropic.com>
Claude-Session: https://claude.ai/code/session_01L8hQ8e5u5KmaH4dD9snyRw
</commit_message>
<xml_diff>
--- a/CaF2_LongAcq_vs_AgSiNW_Code.docx
+++ b/CaF2_LongAcq_vs_AgSiNW_Code.docx
@@ -229,7 +229,7 @@
           <w:sz w:val="15"/>
           <w:noProof/>
         </w:rPr>
-        <w:t># The four spectra differ ~20-fold in counts, so each is drawn with the same height</w:t>
+        <w:t># The four spectra differ ~20-fold in counts; each is drawn with the same height</w:t>
       </w:r>
     </w:p>
     <w:p>
@@ -242,7 +242,7 @@
           <w:sz w:val="15"/>
           <w:noProof/>
         </w:rPr>
-        <w:t># and its own counts scale bar (right), so that the real intensities stay visible.</w:t>
+        <w:t># (scaled to its own range). SHOW_COUNTS = True adds a counts scale bar to each.</w:t>
       </w:r>
     </w:p>
     <w:p>
@@ -473,6 +473,19 @@
           <w:sz w:val="15"/>
           <w:noProof/>
         </w:rPr>
+        <w:t>SHOW_COUNTS = False                                 # True: counts scale bar next to each spectrum</w:t>
+      </w:r>
+    </w:p>
+    <w:p>
+      <w:pPr>
+        <w:spacing w:before="0" w:after="0" w:line="240" w:lineRule="auto"/>
+      </w:pPr>
+      <w:r>
+        <w:rPr>
+          <w:rFonts w:ascii="Consolas" w:hAnsi="Consolas" w:eastAsia="Consolas" w:cs="Consolas"/>
+          <w:sz w:val="15"/>
+          <w:noProof/>
+        </w:rPr>
         <w:t>BAR = {'Ag': 50, 'CaF2': 500}                       # counts shown by the scale bars</w:t>
       </w:r>
     </w:p>
@@ -1501,7 +1514,7 @@
           <w:sz w:val="15"/>
           <w:noProof/>
         </w:rPr>
-        <w:t xml:space="preserve">    for sub in ['CaF2', 'Ag']:</w:t>
+        <w:t xml:space="preserve">    for sub in (['CaF2', 'Ag'] if SHOW_COUNTS else []):</w:t>
       </w:r>
     </w:p>
     <w:p>

</xml_diff>

<commit_message>
CaF2 long-acquisition comparison: Ag/SiNW acquisition written as 4 x 0.5 s
Co-Authored-By: Claude Opus 5.5 <noreply@anthropic.com>
Claude-Session: https://claude.ai/code/session_01L8hQ8e5u5KmaH4dD9snyRw
</commit_message>
<xml_diff>
--- a/CaF2_LongAcq_vs_AgSiNW_Code.docx
+++ b/CaF2_LongAcq_vs_AgSiNW_Code.docx
@@ -112,7 +112,7 @@
           <w:sz w:val="15"/>
           <w:noProof/>
         </w:rPr>
-        <w:t># 4 x 1 s). Raw spectra, same style as the paper figures.</w:t>
+        <w:t># 4 x 0.5 s). Raw spectra, same style as the paper figures.</w:t>
       </w:r>
     </w:p>
     <w:p>
@@ -460,7 +460,7 @@
           <w:sz w:val="15"/>
           <w:noProof/>
         </w:rPr>
-        <w:t>COND = {'Ag': '50\u00d7, 10% laser power, 4 \u00d7 1 s', 'CaF2': '100\u00d7, 100% laser power, 4 \u00d7 60 s'}</w:t>
+        <w:t>COND = {'Ag': '50\u00d7, 10% laser power, 4 \u00d7 0.5 s', 'CaF2': '100\u00d7, 100% laser power, 4 \u00d7 60 s'}</w:t>
       </w:r>
     </w:p>
     <w:p>

</xml_diff>

<commit_message>
CaF2 long-acquisition comparison: main labels only (conditions go in the caption)
Co-Authored-By: Claude Opus 5.5 <noreply@anthropic.com>
Claude-Session: https://claude.ai/code/session_01L8hQ8e5u5KmaH4dD9snyRw
</commit_message>
<xml_diff>
--- a/CaF2_LongAcq_vs_AgSiNW_Code.docx
+++ b/CaF2_LongAcq_vs_AgSiNW_Code.docx
@@ -473,6 +473,19 @@
           <w:sz w:val="15"/>
           <w:noProof/>
         </w:rPr>
+        <w:t>SHOW_CONDITIONS = False                             # True: acquisition conditions after each name</w:t>
+      </w:r>
+    </w:p>
+    <w:p>
+      <w:pPr>
+        <w:spacing w:before="0" w:after="0" w:line="240" w:lineRule="auto"/>
+      </w:pPr>
+      <w:r>
+        <w:rPr>
+          <w:rFonts w:ascii="Consolas" w:hAnsi="Consolas" w:eastAsia="Consolas" w:cs="Consolas"/>
+          <w:sz w:val="15"/>
+          <w:noProof/>
+        </w:rPr>
         <w:t>SHOW_COUNTS = False                                 # True: counts scale bar next to each spectrum</w:t>
       </w:r>
     </w:p>
@@ -1475,7 +1488,20 @@
           <w:sz w:val="15"/>
           <w:noProof/>
         </w:rPr>
-        <w:t xml:space="preserve">        axL.text(415, y_top + 0.03, f'{NAME[s]} on {where}  ({COND[sub]})', color=COL[s],</w:t>
+        <w:t xml:space="preserve">        label = f'{NAME[s]} on {where}' + (f'  ({COND[sub]})' if SHOW_CONDITIONS else '')</w:t>
+      </w:r>
+    </w:p>
+    <w:p>
+      <w:pPr>
+        <w:spacing w:before="0" w:after="0" w:line="240" w:lineRule="auto"/>
+      </w:pPr>
+      <w:r>
+        <w:rPr>
+          <w:rFonts w:ascii="Consolas" w:hAnsi="Consolas" w:eastAsia="Consolas" w:cs="Consolas"/>
+          <w:sz w:val="15"/>
+          <w:noProof/>
+        </w:rPr>
+        <w:t xml:space="preserve">        axL.text(415, y_top + 0.03, label, color=COL[s],</w:t>
       </w:r>
     </w:p>
     <w:p>

</xml_diff>